<commit_message>
feat: prepare policy-safe held video drafts
</commit_message>
<xml_diff>
--- a/docs/course-production/held-video-recuts/generated/video-slot-01-mindset-script.docx
+++ b/docs/course-production/held-video-recuts/generated/video-slot-01-mindset-script.docx
@@ -117,6 +117,24 @@
     </w:p>
     <w:p>
       <w:pPr>
+        <w:spacing w:after="60"/>
+      </w:pPr>
+      <w:r>
+        <w:rPr>
+          <w:rFonts w:ascii="Calibri" w:hAnsi="Calibri"/>
+          <w:b/>
+        </w:rPr>
+        <w:t xml:space="preserve">Source depth: </w:t>
+      </w:r>
+      <w:r>
+        <w:rPr>
+          <w:rFonts w:ascii="Calibri" w:hAnsi="Calibri"/>
+        </w:rPr>
+        <w:t>795 spoken words; minimum 780</w:t>
+      </w:r>
+    </w:p>
+    <w:p>
+      <w:pPr>
         <w:pStyle w:val="Heading1"/>
       </w:pPr>
       <w:r>
@@ -161,7 +179,28 @@
         <w:keepLines/>
       </w:pPr>
       <w:r>
-        <w:t>Before you start a conversation, settle your attention. You are there to understand the situation, help the seller see the available next step, and keep the record accurate. You do not need to force an outcome.</w:t>
+        <w:t>Before you begin a seller conversation, settle your attention. You are there to understand the situation, make the available next step clearer, and leave an accurate record. The words matter, but the mindset underneath them will shape how those words land. These ten principles give you something steady to return to when a conversation moves away from the script or starts to feel tense.</w:t>
+      </w:r>
+    </w:p>
+    <w:p>
+      <w:pPr>
+        <w:keepNext/>
+        <w:keepLines/>
+        <w:spacing w:after="60"/>
+      </w:pPr>
+      <w:r>
+        <w:rPr>
+          <w:rFonts w:ascii="Calibri" w:hAnsi="Calibri"/>
+          <w:b/>
+          <w:color w:val="1F4D78"/>
+        </w:rPr>
+        <w:t xml:space="preserve">Coverage: </w:t>
+      </w:r>
+      <w:r>
+        <w:rPr>
+          <w:rFonts w:ascii="Calibri" w:hAnsi="Calibri"/>
+        </w:rPr>
+        <w:t>operating-system</w:t>
       </w:r>
     </w:p>
     <w:p>
@@ -182,7 +221,7 @@
         <w:rPr>
           <w:rFonts w:ascii="Calibri" w:hAnsi="Calibri"/>
         </w:rPr>
-        <w:t>Andrea standing in a medium shot</w:t>
+        <w:t>Andrea in a calm medium shot</w:t>
       </w:r>
     </w:p>
     <w:p>
@@ -204,7 +243,7 @@
           <w:i/>
           <w:color w:val="666666"/>
         </w:rPr>
-        <w:t>Open with a calm breath and grounded posture.</w:t>
+        <w:t>Open with a quiet reset before the principles begin.</w:t>
       </w:r>
     </w:p>
     <w:p>
@@ -222,7 +261,28 @@
         <w:keepLines/>
       </w:pPr>
       <w:r>
-        <w:t>Start with service. Assume the conversation should be useful even when the seller chooses another path. When you stop chasing the result, you can listen for what would actually help.</w:t>
+        <w:t>First, start with service. Imagine someone inherited a house far from home. They may care less about squeezing out the last possible dollar than finding a path they can understand and manage. Ask what would make the situation easier. If BMH is not the right fit, say that plainly and help the person identify a responsible next step. The conversation can still be useful even when it does not become a deal.</w:t>
+      </w:r>
+    </w:p>
+    <w:p>
+      <w:pPr>
+        <w:keepNext/>
+        <w:keepLines/>
+        <w:spacing w:after="60"/>
+      </w:pPr>
+      <w:r>
+        <w:rPr>
+          <w:rFonts w:ascii="Calibri" w:hAnsi="Calibri"/>
+          <w:b/>
+          <w:color w:val="1F4D78"/>
+        </w:rPr>
+        <w:t xml:space="preserve">Coverage: </w:t>
+      </w:r>
+      <w:r>
+        <w:rPr>
+          <w:rFonts w:ascii="Calibri" w:hAnsi="Calibri"/>
+        </w:rPr>
+        <w:t>service-over-self, inherited-distance</w:t>
       </w:r>
     </w:p>
     <w:p>
@@ -243,7 +303,7 @@
         <w:rPr>
           <w:rFonts w:ascii="Calibri" w:hAnsi="Calibri"/>
         </w:rPr>
-        <w:t>Andrea with an open-hand gesture</w:t>
+        <w:t>Andrea beside a seller looking at a distant property on a simple map</w:t>
       </w:r>
     </w:p>
     <w:p>
@@ -265,7 +325,7 @@
           <w:i/>
           <w:color w:val="666666"/>
         </w:rPr>
-        <w:t>Optional cutaway may show a seller sorting inherited-property paperwork.</w:t>
+        <w:t>Use no named market or fixed travel distance.</w:t>
       </w:r>
     </w:p>
     <w:p>
@@ -274,7 +334,7 @@
         <w:keepNext/>
       </w:pPr>
       <w:r>
-        <w:t>Scene 3: Get on their side of the table</w:t>
+        <w:t>Scene 3: Get on the seller's side of the table</w:t>
       </w:r>
     </w:p>
     <w:p>
@@ -283,7 +343,28 @@
         <w:keepLines/>
       </w:pPr>
       <w:r>
-        <w:t>Try to see the situation from the seller's side. A property problem can also be a time problem, a family problem, or a stress problem. Name what you heard before you ask the next question.</w:t>
+        <w:t>Second, understand the burden before you study the property. A tired landlord may mention a roof, a tenant, or a repair bill, while the deeper issue is that the property has been consuming attention for too long. Say back what you heard. You might say, It sounds like you want your time back and you need a path that does not create another project. That tells the seller you are listening to the life around the house.</w:t>
+      </w:r>
+    </w:p>
+    <w:p>
+      <w:pPr>
+        <w:keepNext/>
+        <w:keepLines/>
+        <w:spacing w:after="60"/>
+      </w:pPr>
+      <w:r>
+        <w:rPr>
+          <w:rFonts w:ascii="Calibri" w:hAnsi="Calibri"/>
+          <w:b/>
+          <w:color w:val="1F4D78"/>
+        </w:rPr>
+        <w:t xml:space="preserve">Coverage: </w:t>
+      </w:r>
+      <w:r>
+        <w:rPr>
+          <w:rFonts w:ascii="Calibri" w:hAnsi="Calibri"/>
+        </w:rPr>
+        <w:t>alignment, tired-landlord</w:t>
       </w:r>
     </w:p>
     <w:p>
@@ -304,7 +385,7 @@
         <w:rPr>
           <w:rFonts w:ascii="Calibri" w:hAnsi="Calibri"/>
         </w:rPr>
-        <w:t>Andrea seated at a desk</w:t>
+        <w:t>Andrea listening to a seller beside a worn property folder</w:t>
       </w:r>
     </w:p>
     <w:p>
@@ -326,7 +407,7 @@
           <w:i/>
           <w:color w:val="666666"/>
         </w:rPr>
-        <w:t>Use a listening posture and a small nod.</w:t>
+        <w:t>Keep the emphasis on the seller's burden rather than the repair list.</w:t>
       </w:r>
     </w:p>
     <w:p>
@@ -344,7 +425,28 @@
         <w:keepLines/>
       </w:pPr>
       <w:r>
-        <w:t>When someone is unsure, help them make the decision clearer. Ask what a workable outcome would look like, what needs to happen first, and what information is missing. A visible path is easier to evaluate than a rushed decision.</w:t>
+        <w:t>Third, help the seller see the path. When someone says they need to think, the decision may still feel blurry. Ask what part is unresolved. Where would they live next? Which responsibility worries them? What would they need to verify before a decision felt responsible? Do not push for an answer while the picture is incomplete. Turn the vague hesitation into a specific question the seller can examine.</w:t>
+      </w:r>
+    </w:p>
+    <w:p>
+      <w:pPr>
+        <w:keepNext/>
+        <w:keepLines/>
+        <w:spacing w:after="60"/>
+      </w:pPr>
+      <w:r>
+        <w:rPr>
+          <w:rFonts w:ascii="Calibri" w:hAnsi="Calibri"/>
+          <w:b/>
+          <w:color w:val="1F4D78"/>
+        </w:rPr>
+        <w:t xml:space="preserve">Coverage: </w:t>
+      </w:r>
+      <w:r>
+        <w:rPr>
+          <w:rFonts w:ascii="Calibri" w:hAnsi="Calibri"/>
+        </w:rPr>
+        <w:t>clarity, blurry-path</w:t>
       </w:r>
     </w:p>
     <w:p>
@@ -365,7 +467,7 @@
         <w:rPr>
           <w:rFonts w:ascii="Calibri" w:hAnsi="Calibri"/>
         </w:rPr>
-        <w:t>Andrea beside a simple two-path diagram</w:t>
+        <w:t>Andrea beside a seller sorting a few unlabeled decision cards</w:t>
       </w:r>
     </w:p>
     <w:p>
@@ -387,7 +489,7 @@
           <w:i/>
           <w:color w:val="666666"/>
         </w:rPr>
-        <w:t>Keep the diagram generic and free of promised outcomes.</w:t>
+        <w:t>The path becomes clearer without a countdown or urgency device.</w:t>
       </w:r>
     </w:p>
     <w:p>
@@ -396,7 +498,7 @@
         <w:keepNext/>
       </w:pPr>
       <w:r>
-        <w:t>Scene 5: Own your actions</w:t>
+        <w:t>Scene 5: Own the actions you control</w:t>
       </w:r>
     </w:p>
     <w:p>
@@ -405,7 +507,28 @@
         <w:keepLines/>
       </w:pPr>
       <w:r>
-        <w:t>You cannot control whether someone answers, agrees, or changes their mind. You can control your preparation, your tone, the quality of your notes, and whether you complete the next action you promised.</w:t>
+        <w:t>Fourth, separate your work from the seller's choice. Someone may not answer, may choose another path, or may change their mind. You still control your preparation, your tone, the accuracy of your notes, and whether you complete the follow-up you promised. If a contact goes unanswered, leave the record ready for the next attempt and move to the next assigned action. Accountability stays useful even when the outcome does not cooperate.</w:t>
+      </w:r>
+    </w:p>
+    <w:p>
+      <w:pPr>
+        <w:keepNext/>
+        <w:keepLines/>
+        <w:spacing w:after="60"/>
+      </w:pPr>
+      <w:r>
+        <w:rPr>
+          <w:rFonts w:ascii="Calibri" w:hAnsi="Calibri"/>
+          <w:b/>
+          <w:color w:val="1F4D78"/>
+        </w:rPr>
+        <w:t xml:space="preserve">Coverage: </w:t>
+      </w:r>
+      <w:r>
+        <w:rPr>
+          <w:rFonts w:ascii="Calibri" w:hAnsi="Calibri"/>
+        </w:rPr>
+        <w:t>controllable-actions, unreturned-contact</w:t>
       </w:r>
     </w:p>
     <w:p>
@@ -426,7 +549,7 @@
         <w:rPr>
           <w:rFonts w:ascii="Calibri" w:hAnsi="Calibri"/>
         </w:rPr>
-        <w:t>Andrea in a closer medium frame</w:t>
+        <w:t>Andrea beside a simple preparation, notes, and follow-through loop</w:t>
       </w:r>
     </w:p>
     <w:p>
@@ -448,7 +571,7 @@
           <w:i/>
           <w:color w:val="666666"/>
         </w:rPr>
-        <w:t>Shift to a more direct posture for accountability.</w:t>
+        <w:t>Use no call count, quota, or results chart.</w:t>
       </w:r>
     </w:p>
     <w:p>
@@ -466,7 +589,28 @@
         <w:keepLines/>
       </w:pPr>
       <w:r>
-        <w:t>Simple questions work. Ask one, then give the person room to answer. If you are planning your next line while they are still talking, you are likely to miss the useful detail.</w:t>
+        <w:t>Fifth, ask a simple question and wait. Suppose the seller says, The house has become too much. You could jump into a solution, or you could ask, What part has become hardest to manage? Then leave enough silence for the real answer. The seller may reveal a repair, a family disagreement, or an approaching move. You did not need a clever line. You needed enough curiosity to hear the detail that changes the conversation.</w:t>
+      </w:r>
+    </w:p>
+    <w:p>
+      <w:pPr>
+        <w:keepNext/>
+        <w:keepLines/>
+        <w:spacing w:after="60"/>
+      </w:pPr>
+      <w:r>
+        <w:rPr>
+          <w:rFonts w:ascii="Calibri" w:hAnsi="Calibri"/>
+          <w:b/>
+          <w:color w:val="1F4D78"/>
+        </w:rPr>
+        <w:t xml:space="preserve">Coverage: </w:t>
+      </w:r>
+      <w:r>
+        <w:rPr>
+          <w:rFonts w:ascii="Calibri" w:hAnsi="Calibri"/>
+        </w:rPr>
+        <w:t>curiosity, silence-reveals-detail</w:t>
       </w:r>
     </w:p>
     <w:p>
@@ -487,7 +631,7 @@
         <w:rPr>
           <w:rFonts w:ascii="Calibri" w:hAnsi="Calibri"/>
         </w:rPr>
-        <w:t>Andrea seated with hands relaxed</w:t>
+        <w:t>Andrea seated with open listening posture and an uncluttered speech bubble</w:t>
       </w:r>
     </w:p>
     <w:p>
@@ -509,7 +653,7 @@
           <w:i/>
           <w:color w:val="666666"/>
         </w:rPr>
-        <w:t>Hold a natural pause after the second sentence.</w:t>
+        <w:t>Leave a natural beat after the question.</w:t>
       </w:r>
     </w:p>
     <w:p>
@@ -527,7 +671,28 @@
         <w:keepLines/>
       </w:pPr>
       <w:r>
-        <w:t>Speak peer to peer. Do not beg for agreement, and do not lecture. If something does not fit, say so respectfully. Direct language and a steady tone make the conversation easier to trust.</w:t>
+        <w:t>Sixth, speak peer to peer. You do not need to beg for agreement, and you do not need to lecture. If a number does not fit the current written process, say that respectfully. Ask how the seller arrived at it and what the money needs to accomplish. Direct language can stay warm. The seller should feel that you are taking the concern seriously without pretending that every request is available.</w:t>
+      </w:r>
+    </w:p>
+    <w:p>
+      <w:pPr>
+        <w:keepNext/>
+        <w:keepLines/>
+        <w:spacing w:after="60"/>
+      </w:pPr>
+      <w:r>
+        <w:rPr>
+          <w:rFonts w:ascii="Calibri" w:hAnsi="Calibri"/>
+          <w:b/>
+          <w:color w:val="1F4D78"/>
+        </w:rPr>
+        <w:t xml:space="preserve">Coverage: </w:t>
+      </w:r>
+      <w:r>
+        <w:rPr>
+          <w:rFonts w:ascii="Calibri" w:hAnsi="Calibri"/>
+        </w:rPr>
+        <w:t>equal-status, unworkable-number</w:t>
       </w:r>
     </w:p>
     <w:p>
@@ -548,7 +713,7 @@
         <w:rPr>
           <w:rFonts w:ascii="Calibri" w:hAnsi="Calibri"/>
         </w:rPr>
-        <w:t>Andrea standing square to camera</w:t>
+        <w:t>Andrea in an even eye-level conversational frame</w:t>
       </w:r>
     </w:p>
     <w:p>
@@ -570,7 +735,7 @@
           <w:i/>
           <w:color w:val="666666"/>
         </w:rPr>
-        <w:t>Use a neutral, confident stance.</w:t>
+        <w:t>Avoid dominant or pleading body language.</w:t>
       </w:r>
     </w:p>
     <w:p>
@@ -588,7 +753,28 @@
         <w:keepLines/>
       </w:pPr>
       <w:r>
-        <w:t>A seller who is not ready now may become ready after the situation changes or the options become clearer. Follow up with a useful reason. Bring new information when you have it. Let the seller's decision stage guide the conversation instead of assuming a fixed timeline.</w:t>
+        <w:t>Seventh, respect the seller's decision stage. A person who is not ready may become ready after a repair estimate arrives, another option falls through, or the family reaches agreement. Follow up with a useful reason. Bring new information when you have it. Ask what changed instead of replaying the same pitch. There is no fixed progression to memorize. The facts in the seller's life tell you whether the conversation has moved.</w:t>
+      </w:r>
+    </w:p>
+    <w:p>
+      <w:pPr>
+        <w:keepNext/>
+        <w:keepLines/>
+        <w:spacing w:after="60"/>
+      </w:pPr>
+      <w:r>
+        <w:rPr>
+          <w:rFonts w:ascii="Calibri" w:hAnsi="Calibri"/>
+          <w:b/>
+          <w:color w:val="1F4D78"/>
+        </w:rPr>
+        <w:t xml:space="preserve">Coverage: </w:t>
+      </w:r>
+      <w:r>
+        <w:rPr>
+          <w:rFonts w:ascii="Calibri" w:hAnsi="Calibri"/>
+        </w:rPr>
+        <w:t>long-game, situation-changes</w:t>
       </w:r>
     </w:p>
     <w:p>
@@ -609,7 +795,7 @@
         <w:rPr>
           <w:rFonts w:ascii="Calibri" w:hAnsi="Calibri"/>
         </w:rPr>
-        <w:t>Andrea walking slowly across frame</w:t>
+        <w:t>Andrea beside a seller whose situation cards change</w:t>
       </w:r>
     </w:p>
     <w:p>
@@ -631,7 +817,7 @@
           <w:i/>
           <w:color w:val="666666"/>
         </w:rPr>
-        <w:t>Optional cutaway may show a neutral sequence of follow-up notes with no dates.</w:t>
+        <w:t>Show changing facts without a calendar, clock, or fixed stage timeline.</w:t>
       </w:r>
     </w:p>
     <w:p>
@@ -640,7 +826,7 @@
         <w:keepNext/>
       </w:pPr>
       <w:r>
-        <w:t>Scene 9: Treat problems as missing information</w:t>
+        <w:t>Scene 9: Treat objections as missing information</w:t>
       </w:r>
     </w:p>
     <w:p>
@@ -649,7 +835,28 @@
         <w:keepLines/>
       </w:pPr>
       <w:r>
-        <w:t>An objection is often a missing piece. If someone says they need more money, ask what the money needs to cover. If they need more time, ask what has to happen before they can move. The answer tells you whether there is a responsible next step.</w:t>
+        <w:t>Eighth, look for the missing piece inside the objection. If someone says they need more money, ask what that money needs to cover. It may be a loan balance, moving costs, another commitment, or simply an expectation they have not explained yet. Once you know the purpose, you can tell whether the current process has a responsible option or whether the gap remains. The objection becomes a fact-finding problem instead of a wall.</w:t>
+      </w:r>
+    </w:p>
+    <w:p>
+      <w:pPr>
+        <w:keepNext/>
+        <w:keepLines/>
+        <w:spacing w:after="60"/>
+      </w:pPr>
+      <w:r>
+        <w:rPr>
+          <w:rFonts w:ascii="Calibri" w:hAnsi="Calibri"/>
+          <w:b/>
+          <w:color w:val="1F4D78"/>
+        </w:rPr>
+        <w:t xml:space="preserve">Coverage: </w:t>
+      </w:r>
+      <w:r>
+        <w:rPr>
+          <w:rFonts w:ascii="Calibri" w:hAnsi="Calibri"/>
+        </w:rPr>
+        <w:t>problems-as-puzzles, money-needs-purpose</w:t>
       </w:r>
     </w:p>
     <w:p>
@@ -670,7 +877,7 @@
         <w:rPr>
           <w:rFonts w:ascii="Calibri" w:hAnsi="Calibri"/>
         </w:rPr>
-        <w:t>Andrea beside a small tabletop card</w:t>
+        <w:t>Andrea beside a simple missing-piece diagram and property folder</w:t>
       </w:r>
     </w:p>
     <w:p>
@@ -692,7 +899,7 @@
           <w:i/>
           <w:color w:val="666666"/>
         </w:rPr>
-        <w:t>Use one simple puzzle-piece prop if desired. No floating icon montage.</w:t>
+        <w:t>Use no currency figures or promise language.</w:t>
       </w:r>
     </w:p>
     <w:p>
@@ -710,7 +917,28 @@
         <w:keepLines/>
       </w:pPr>
       <w:r>
-        <w:t>Calm comes from practice and review. Listen back when that is part of the current process. Notice where you rushed, filled silence, or missed a question. Apply one correction in the next conversation.</w:t>
+        <w:t>Ninth, use repetition to become steadier. Review a conversation when the current process allows it. Find the place where you rushed, filled the silence, or missed a useful question. Choose a small correction and practice it out loud. In the next conversation, focus on that correction rather than trying to sound perfect. Calm grows when you have heard the situation before and know what you want to do differently.</w:t>
+      </w:r>
+    </w:p>
+    <w:p>
+      <w:pPr>
+        <w:keepNext/>
+        <w:keepLines/>
+        <w:spacing w:after="60"/>
+      </w:pPr>
+      <w:r>
+        <w:rPr>
+          <w:rFonts w:ascii="Calibri" w:hAnsi="Calibri"/>
+          <w:b/>
+          <w:color w:val="1F4D78"/>
+        </w:rPr>
+        <w:t xml:space="preserve">Coverage: </w:t>
+      </w:r>
+      <w:r>
+        <w:rPr>
+          <w:rFonts w:ascii="Calibri" w:hAnsi="Calibri"/>
+        </w:rPr>
+        <w:t>practice, review-rushed-moment</w:t>
       </w:r>
     </w:p>
     <w:p>
@@ -731,7 +959,7 @@
         <w:rPr>
           <w:rFonts w:ascii="Calibri" w:hAnsi="Calibri"/>
         </w:rPr>
-        <w:t>Andrea at a desk reviewing notes</w:t>
+        <w:t>Andrea reviewing a generic conversation note and practicing a calmer response</w:t>
       </w:r>
     </w:p>
     <w:p>
@@ -753,7 +981,7 @@
           <w:i/>
           <w:color w:val="666666"/>
         </w:rPr>
-        <w:t>Keep any review screen generic and unbranded.</w:t>
+        <w:t>Show reflection and retry without a score or activity counter.</w:t>
       </w:r>
     </w:p>
     <w:p>
@@ -771,7 +999,28 @@
         <w:keepLines/>
       </w:pPr>
       <w:r>
-        <w:t>If you feel yourself trying to win the point, slow down. Restate what the seller is concerned about and check that you have it right. Understanding creates more movement than an argument.</w:t>
+        <w:t>Tenth, check that you understand before you defend a position. A seller may say the offer feels unfair when the deeper concern is that a family member will question the decision. Restate the concern: It sounds like you need everyone involved to understand how the terms were reached. Then ask if you have it right. That short check can keep you from arguing about price when the real need is shared understanding.</w:t>
+      </w:r>
+    </w:p>
+    <w:p>
+      <w:pPr>
+        <w:keepNext/>
+        <w:keepLines/>
+        <w:spacing w:after="60"/>
+      </w:pPr>
+      <w:r>
+        <w:rPr>
+          <w:rFonts w:ascii="Calibri" w:hAnsi="Calibri"/>
+          <w:b/>
+          <w:color w:val="1F4D78"/>
+        </w:rPr>
+        <w:t xml:space="preserve">Coverage: </w:t>
+      </w:r>
+      <w:r>
+        <w:rPr>
+          <w:rFonts w:ascii="Calibri" w:hAnsi="Calibri"/>
+        </w:rPr>
+        <w:t>understand-before-argument, operating-system, restate-concern</w:t>
       </w:r>
     </w:p>
     <w:p>
@@ -792,7 +1041,7 @@
         <w:rPr>
           <w:rFonts w:ascii="Calibri" w:hAnsi="Calibri"/>
         </w:rPr>
-        <w:t>Andrea in a centered medium shot</w:t>
+        <w:t>Andrea in a steady medium shot with a simple listen, restate, check sequence</w:t>
       </w:r>
     </w:p>
     <w:p>
@@ -814,7 +1063,7 @@
           <w:i/>
           <w:color w:val="666666"/>
         </w:rPr>
-        <w:t>Use a small reset gesture at the opening.</w:t>
+        <w:t>Keep the sequence conversational rather than instructional on screen.</w:t>
       </w:r>
     </w:p>
     <w:p>
@@ -833,6 +1082,27 @@
       </w:pPr>
       <w:r>
         <w:t>Take the Welcome and Mindset checkpoint next. Then move into Terms Glossary.</w:t>
+      </w:r>
+    </w:p>
+    <w:p>
+      <w:pPr>
+        <w:keepNext/>
+        <w:keepLines/>
+        <w:spacing w:after="60"/>
+      </w:pPr>
+      <w:r>
+        <w:rPr>
+          <w:rFonts w:ascii="Calibri" w:hAnsi="Calibri"/>
+          <w:b/>
+          <w:color w:val="1F4D78"/>
+        </w:rPr>
+        <w:t xml:space="preserve">Coverage: </w:t>
+      </w:r>
+      <w:r>
+        <w:rPr>
+          <w:rFonts w:ascii="Calibri" w:hAnsi="Calibri"/>
+        </w:rPr>
+        <w:t>checkpoint-transition</w:t>
       </w:r>
     </w:p>
     <w:p>

</xml_diff>